<commit_message>
feat: Add menu and detailed menu guide documents.
</commit_message>
<xml_diff>
--- a/public/huongdan/thucdon.docx
+++ b/public/huongdan/thucdon.docx
@@ -9,217 +9,178 @@
           <w:szCs w:val="28"/>
         </w:rPr>
       </w:pPr>
-      <w:r>
-        <w:rPr>
-          <w:szCs w:val="28"/>
-        </w:rPr>
-        <w:t>1.</w:t>
-      </w:r>
-      <w:r>
-        <w:rPr>
-          <w:szCs w:val="28"/>
-        </w:rPr>
-        <w:t xml:space="preserve"> Thực đơn của trẻ trong ngày gồm những bữa nào?</w:t>
-      </w:r>
-    </w:p>
-    <w:p>
-      <w:pPr>
-        <w:pStyle w:val="NoSpacing"/>
-        <w:rPr>
-          <w:szCs w:val="28"/>
-        </w:rPr>
-      </w:pPr>
-      <w:r>
-        <w:rPr>
-          <w:rFonts w:ascii="Segoe UI Symbol" w:hAnsi="Segoe UI Symbol" w:cs="Segoe UI Symbol"/>
-          <w:szCs w:val="28"/>
-        </w:rPr>
-        <w:t>👉</w:t>
-      </w:r>
-      <w:r>
-        <w:rPr>
-          <w:szCs w:val="28"/>
-        </w:rPr>
-        <w:t xml:space="preserve"> Trả lời: Trẻ được ăn 3 bữa tại trường gồm: bữa trưa (bữa chính), bữa phụ và bữa chiều.</w:t>
-      </w:r>
-    </w:p>
-    <w:p>
-      <w:pPr>
-        <w:pStyle w:val="NoSpacing"/>
-        <w:rPr>
-          <w:szCs w:val="28"/>
-        </w:rPr>
-      </w:pPr>
-      <w:r>
-        <w:rPr>
-          <w:szCs w:val="28"/>
-        </w:rPr>
-        <w:t>2.</w:t>
-      </w:r>
-      <w:r>
-        <w:rPr>
-          <w:rFonts w:ascii="Tahoma" w:hAnsi="Tahoma" w:cs="Tahoma"/>
-          <w:szCs w:val="28"/>
-        </w:rPr>
-        <w:t xml:space="preserve"> </w:t>
-      </w:r>
-      <w:r>
-        <w:rPr>
-          <w:szCs w:val="28"/>
-        </w:rPr>
-        <w:t>Thực đơn có thay đổi theo tuần không?</w:t>
-      </w:r>
-    </w:p>
-    <w:p>
-      <w:pPr>
-        <w:pStyle w:val="NoSpacing"/>
-        <w:rPr>
-          <w:szCs w:val="28"/>
-        </w:rPr>
-      </w:pPr>
-      <w:r>
-        <w:rPr>
-          <w:rFonts w:ascii="Segoe UI Symbol" w:hAnsi="Segoe UI Symbol" w:cs="Segoe UI Symbol"/>
-          <w:szCs w:val="28"/>
-        </w:rPr>
-        <w:t>👉</w:t>
-      </w:r>
-      <w:r>
-        <w:rPr>
-          <w:szCs w:val="28"/>
-        </w:rPr>
-        <w:t xml:space="preserve"> Trả lời: Có. Thực đơn được chia theo tuần (Tuần 1+3 và Tuần 2+4) và thay đổi để giúp trẻ ăn đa dạng, không bị ngán.</w:t>
-      </w:r>
-    </w:p>
-    <w:p>
-      <w:pPr>
-        <w:pStyle w:val="NoSpacing"/>
-        <w:rPr>
-          <w:szCs w:val="28"/>
-        </w:rPr>
-      </w:pPr>
-      <w:r>
-        <w:rPr>
-          <w:szCs w:val="28"/>
-        </w:rPr>
-        <w:t>3.</w:t>
-      </w:r>
-      <w:r>
-        <w:rPr>
-          <w:szCs w:val="28"/>
-        </w:rPr>
-        <w:t xml:space="preserve"> Các món ăn có phong phú không?</w:t>
-      </w:r>
-    </w:p>
-    <w:p>
-      <w:pPr>
-        <w:pStyle w:val="NoSpacing"/>
-        <w:rPr>
-          <w:szCs w:val="28"/>
-        </w:rPr>
-      </w:pPr>
-      <w:r>
-        <w:rPr>
-          <w:rFonts w:ascii="Segoe UI Symbol" w:hAnsi="Segoe UI Symbol" w:cs="Segoe UI Symbol"/>
-          <w:szCs w:val="28"/>
-        </w:rPr>
-        <w:t>👉</w:t>
-      </w:r>
-      <w:r>
-        <w:rPr>
-          <w:szCs w:val="28"/>
-        </w:rPr>
-        <w:t xml:space="preserve"> Trả lời: Thực đơn gồm nhiều món đa dạng như: cơm với thịt, cá, trứng; canh rau; cháo; bún; xôi; bánh và hoa quả, đảm bảo thay đổi thường xuyên.</w:t>
-      </w:r>
-    </w:p>
-    <w:p>
-      <w:pPr>
-        <w:pStyle w:val="NoSpacing"/>
-        <w:rPr>
-          <w:szCs w:val="28"/>
-        </w:rPr>
-      </w:pPr>
-      <w:r>
-        <w:rPr>
-          <w:szCs w:val="28"/>
-        </w:rPr>
-        <w:t>4.</w:t>
-      </w:r>
-      <w:r>
-        <w:rPr>
-          <w:szCs w:val="28"/>
-        </w:rPr>
-        <w:t xml:space="preserve"> Trẻ có được ăn hoa quả không?</w:t>
-      </w:r>
-    </w:p>
-    <w:p>
-      <w:pPr>
-        <w:pStyle w:val="NoSpacing"/>
-        <w:rPr>
-          <w:szCs w:val="28"/>
-        </w:rPr>
-      </w:pPr>
-      <w:r>
-        <w:rPr>
-          <w:rFonts w:ascii="Segoe UI Symbol" w:hAnsi="Segoe UI Symbol" w:cs="Segoe UI Symbol"/>
-          <w:szCs w:val="28"/>
-        </w:rPr>
-        <w:t>👉</w:t>
-      </w:r>
-      <w:r>
-        <w:rPr>
-          <w:szCs w:val="28"/>
-        </w:rPr>
-        <w:t xml:space="preserve"> Trả lời: Có. Hoa quả được bổ sung trong các bữa phụ để cung cấp vitamin và giúp trẻ phát triển tốt.</w:t>
-      </w:r>
-    </w:p>
-    <w:p>
-      <w:pPr>
-        <w:pStyle w:val="NoSpacing"/>
-        <w:rPr>
-          <w:szCs w:val="28"/>
-        </w:rPr>
-      </w:pPr>
-      <w:r>
-        <w:rPr>
-          <w:szCs w:val="28"/>
-        </w:rPr>
-        <w:t>5.</w:t>
-      </w:r>
-      <w:r>
-        <w:rPr>
-          <w:szCs w:val="28"/>
-        </w:rPr>
-        <w:t xml:space="preserve"> Trẻ có được uống sữa không?</w:t>
-      </w:r>
-    </w:p>
-    <w:p>
-      <w:pPr>
-        <w:pStyle w:val="NoSpacing"/>
-        <w:rPr>
-          <w:szCs w:val="28"/>
-        </w:rPr>
-      </w:pPr>
-      <w:r>
-        <w:rPr>
-          <w:rFonts w:ascii="Segoe UI Symbol" w:hAnsi="Segoe UI Symbol" w:cs="Segoe UI Symbol"/>
-          <w:szCs w:val="28"/>
-        </w:rPr>
-        <w:t>👉</w:t>
-      </w:r>
-      <w:r>
-        <w:rPr>
-          <w:szCs w:val="28"/>
-        </w:rPr>
-        <w:t xml:space="preserve"> Trả lời: Có. Nhà trường bố trí các ngày uống sữa xen kẽ trong tuần để bổ sung </w:t>
-      </w:r>
       <w:bookmarkStart w:id="0" w:name="_GoBack"/>
       <w:bookmarkEnd w:id="0"/>
-      <w:r>
-        <w:rPr>
-          <w:szCs w:val="28"/>
-        </w:rPr>
-        <w:t>dinh dưỡng cho trẻ.</w:t>
+    </w:p>
+    <w:p>
+      <w:pPr>
+        <w:pStyle w:val="NoSpacing"/>
+        <w:rPr>
+          <w:szCs w:val="28"/>
+        </w:rPr>
+      </w:pPr>
+      <w:r>
+        <w:rPr>
+          <w:szCs w:val="28"/>
+        </w:rPr>
+        <w:t>2.</w:t>
+      </w:r>
+      <w:r>
+        <w:rPr>
+          <w:rFonts w:ascii="Tahoma" w:hAnsi="Tahoma" w:cs="Tahoma"/>
+          <w:szCs w:val="28"/>
+        </w:rPr>
+        <w:t xml:space="preserve"> </w:t>
+      </w:r>
+      <w:r>
+        <w:rPr>
+          <w:szCs w:val="28"/>
+        </w:rPr>
+        <w:t>Thực đơn có thay đổi theo tuần không?</w:t>
+      </w:r>
+    </w:p>
+    <w:p>
+      <w:pPr>
+        <w:pStyle w:val="NoSpacing"/>
+        <w:rPr>
+          <w:szCs w:val="28"/>
+        </w:rPr>
+      </w:pPr>
+      <w:r>
+        <w:rPr>
+          <w:rFonts w:ascii="Segoe UI Symbol" w:hAnsi="Segoe UI Symbol" w:cs="Segoe UI Symbol"/>
+          <w:szCs w:val="28"/>
+        </w:rPr>
+        <w:t>👉</w:t>
+      </w:r>
+      <w:r>
+        <w:rPr>
+          <w:szCs w:val="28"/>
+        </w:rPr>
+        <w:t xml:space="preserve"> Trả lời: Có. Thực đơn được chia theo tuần (Tuần 1+3 và Tuần 2+4) và thay đổi để giúp trẻ ăn đa dạng, không bị ngán.</w:t>
+      </w:r>
+    </w:p>
+    <w:p>
+      <w:pPr>
+        <w:pStyle w:val="NoSpacing"/>
+        <w:rPr>
+          <w:szCs w:val="28"/>
+        </w:rPr>
+      </w:pPr>
+      <w:r>
+        <w:rPr>
+          <w:szCs w:val="28"/>
+        </w:rPr>
+        <w:t>3.</w:t>
+      </w:r>
+      <w:r>
+        <w:rPr>
+          <w:szCs w:val="28"/>
+        </w:rPr>
+        <w:t xml:space="preserve"> Các món ăn có phong phú không?</w:t>
+      </w:r>
+    </w:p>
+    <w:p>
+      <w:pPr>
+        <w:pStyle w:val="NoSpacing"/>
+        <w:rPr>
+          <w:szCs w:val="28"/>
+        </w:rPr>
+      </w:pPr>
+      <w:r>
+        <w:rPr>
+          <w:rFonts w:ascii="Segoe UI Symbol" w:hAnsi="Segoe UI Symbol" w:cs="Segoe UI Symbol"/>
+          <w:szCs w:val="28"/>
+        </w:rPr>
+        <w:t>👉</w:t>
+      </w:r>
+      <w:r>
+        <w:rPr>
+          <w:szCs w:val="28"/>
+        </w:rPr>
+        <w:t xml:space="preserve"> Trả lời: Thực đơn gồm nhiều món đa dạng như: cơm với thịt, cá, trứng; canh rau; cháo; bún; xôi; bánh và hoa quả, đảm bảo thay đổi thường xuyên.</w:t>
+      </w:r>
+    </w:p>
+    <w:p>
+      <w:pPr>
+        <w:pStyle w:val="NoSpacing"/>
+        <w:rPr>
+          <w:szCs w:val="28"/>
+        </w:rPr>
+      </w:pPr>
+      <w:r>
+        <w:rPr>
+          <w:szCs w:val="28"/>
+        </w:rPr>
+        <w:t>4.</w:t>
+      </w:r>
+      <w:r>
+        <w:rPr>
+          <w:szCs w:val="28"/>
+        </w:rPr>
+        <w:t xml:space="preserve"> Trẻ có được ăn hoa quả không?</w:t>
+      </w:r>
+    </w:p>
+    <w:p>
+      <w:pPr>
+        <w:pStyle w:val="NoSpacing"/>
+        <w:rPr>
+          <w:szCs w:val="28"/>
+        </w:rPr>
+      </w:pPr>
+      <w:r>
+        <w:rPr>
+          <w:rFonts w:ascii="Segoe UI Symbol" w:hAnsi="Segoe UI Symbol" w:cs="Segoe UI Symbol"/>
+          <w:szCs w:val="28"/>
+        </w:rPr>
+        <w:t>👉</w:t>
+      </w:r>
+      <w:r>
+        <w:rPr>
+          <w:szCs w:val="28"/>
+        </w:rPr>
+        <w:t xml:space="preserve"> Trả lời: Có. Hoa quả được bổ sung trong các bữa phụ để cung cấp vitamin và giúp trẻ phát triển tốt.</w:t>
+      </w:r>
+    </w:p>
+    <w:p>
+      <w:pPr>
+        <w:pStyle w:val="NoSpacing"/>
+        <w:rPr>
+          <w:szCs w:val="28"/>
+        </w:rPr>
+      </w:pPr>
+      <w:r>
+        <w:rPr>
+          <w:szCs w:val="28"/>
+        </w:rPr>
+        <w:t>5.</w:t>
+      </w:r>
+      <w:r>
+        <w:rPr>
+          <w:szCs w:val="28"/>
+        </w:rPr>
+        <w:t xml:space="preserve"> Trẻ có được uống sữa không?</w:t>
+      </w:r>
+    </w:p>
+    <w:p>
+      <w:pPr>
+        <w:pStyle w:val="NoSpacing"/>
+        <w:rPr>
+          <w:szCs w:val="28"/>
+        </w:rPr>
+      </w:pPr>
+      <w:r>
+        <w:rPr>
+          <w:rFonts w:ascii="Segoe UI Symbol" w:hAnsi="Segoe UI Symbol" w:cs="Segoe UI Symbol"/>
+          <w:szCs w:val="28"/>
+        </w:rPr>
+        <w:t>👉</w:t>
+      </w:r>
+      <w:r>
+        <w:rPr>
+          <w:szCs w:val="28"/>
+        </w:rPr>
+        <w:t xml:space="preserve"> Trả lời: Có. Nhà trường bố trí các ngày uống sữa xen kẽ trong tuần để bổ sung dinh dưỡng cho trẻ.</w:t>
       </w:r>
     </w:p>
     <w:p>
@@ -410,13 +371,7 @@
         <w:rPr>
           <w:szCs w:val="28"/>
         </w:rPr>
-        <w:t>10</w:t>
-      </w:r>
-      <w:r>
-        <w:rPr>
-          <w:szCs w:val="28"/>
-        </w:rPr>
-        <w:t xml:space="preserve">. </w:t>
+        <w:t xml:space="preserve">10. </w:t>
       </w:r>
       <w:r>
         <w:rPr>

</xml_diff>